<commit_message>
updating links in assignment 2 word doc
</commit_message>
<xml_diff>
--- a/assignment_materials/Assignment_2/DSPN_Spring2026_Assignment2.docx
+++ b/assignment_materials/Assignment_2/DSPN_Spring2026_Assignment2.docx
@@ -166,6 +166,18 @@
       <w:r>
         <w:t xml:space="preserve"> </w:t>
       </w:r>
+      <w:hyperlink r:id="rId6" w:history="1">
+        <w:r>
+          <w:rPr>
+            <w:rStyle w:val="Hyperlink"/>
+            <w:highlight w:val="lightGray"/>
+          </w:rPr>
+          <w:t>https://github.com/JeremyHogeveen/dspn_spring2026_github/blob/main/assignment_materials/Assignment_2/DSPN_Spring2026_Assignment2_OscillatorStarter.ipynb</w:t>
+        </w:r>
+      </w:hyperlink>
+      <w:r>
+        <w:t xml:space="preserve"> </w:t>
+      </w:r>
     </w:p>
     <w:p/>
     <w:p>
@@ -235,7 +247,31 @@
         <w:rPr>
           <w:highlight w:val="lightGray"/>
         </w:rPr>
-        <w:t xml:space="preserve"> instructions and starter code here:</w:t>
+        <w:t xml:space="preserve"> instructions and starter code </w:t>
+      </w:r>
+      <w:r>
+        <w:rPr>
+          <w:highlight w:val="lightGray"/>
+        </w:rPr>
+        <w:t>here:</w:t>
+      </w:r>
+      <w:r>
+        <w:rPr>
+          <w:highlight w:val="lightGray"/>
+        </w:rPr>
+        <w:t xml:space="preserve"> </w:t>
+      </w:r>
+      <w:hyperlink r:id="rId7" w:history="1">
+        <w:r>
+          <w:rPr>
+            <w:rStyle w:val="Hyperlink"/>
+            <w:highlight w:val="lightGray"/>
+          </w:rPr>
+          <w:t>https://github.com/JeremyHogeveen/dspn_spring2026_github/blob/main/assignment_materials/Assignment_2/DSPN_Spring2026_Assignment2_IntegrateAndFireStarter.ipynb</w:t>
+        </w:r>
+      </w:hyperlink>
+      <w:r>
+        <w:t xml:space="preserve"> </w:t>
       </w:r>
       <w:r>
         <w:t xml:space="preserve"> </w:t>
@@ -321,13 +357,7 @@
         </w:numPr>
       </w:pPr>
       <w:r>
-        <w:t xml:space="preserve">If you have a bit of comfort, feel free to choose options 1 or 2 depending on your relative comfort, and see if you can incorporate creative uses of advanced tools that I don’t hint at in the </w:t>
-      </w:r>
-      <w:r>
-        <w:t xml:space="preserve">“starter code” </w:t>
-      </w:r>
-      <w:r>
-        <w:t>(e.g. functions, dictionaries, etc.)</w:t>
+        <w:t>If you have a bit of comfort, feel free to choose options 1 or 2 depending on your relative comfort, and see if you can incorporate creative uses of advanced tools that I don’t hint at in the “starter code” (e.g. functions, dictionaries, etc.)</w:t>
       </w:r>
     </w:p>
     <w:p>

</xml_diff>